<commit_message>
docs: add Chapter 3 - 8 Strategic Monetization & Revenue Generation Streams to so_sanh_voi_product_real.docx
</commit_message>
<xml_diff>
--- a/so_sanh_voi_product_real.docx
+++ b/so_sanh_voi_product_real.docx
@@ -15,7 +15,7 @@
           <w:sz w:val="28"/>
           <w:szCs w:val="28"/>
         </w:rPr>
-        <w:t xml:space="preserve">BÁO CÁO PHÂN TÍCH SO SÁNH: PROTOTYPE ĐỒ ÁN vs SẢN PHẨM THƯƠNG MẠI THỰC TẾ (REAL MONETIZED PRODUCT)</w:t>
+        <w:t xml:space="preserve">BÁO CÁO PHÂN TÍCH SO SÁNH &amp; CHIẾN LƯỢC TẠO DOANH THU THƯƠNG MẠI (MONETIZATION MODEL)</w:t>
       </w:r>
     </w:p>
     <w:p>
@@ -31,7 +31,7 @@
           <w:sz w:val="22"/>
           <w:szCs w:val="22"/>
         </w:rPr>
-        <w:t xml:space="preserve">Dự án HảiSản.vn (sea_shop) — Đánh Giá Hạ Tầng Kỹ Thuật, Mô Hình Doanh Thu &amp; Lộ Trình Thương Mại Hóa</w:t>
+        <w:t xml:space="preserve">Dự án HảiSản.vn (sea_shop) — Đánh Giá Hạ Tầng Kỹ Thuật, 8 Mô Hình Doanh Thu Đa Kênh &amp; Lộ Trình Triển Khai</w:t>
       </w:r>
     </w:p>
     <w:p>
@@ -1139,64 +1139,1055 @@
           <w:sz w:val="24"/>
           <w:szCs w:val="24"/>
         </w:rPr>
-        <w:t xml:space="preserve">CHƯƠNG 3. BỐN NẤC THANG NÂNG CẤP ĐỂ BIẾN SEA_SHOP THÀNH PRODUCT THƯƠNG MẠI TRIỆU USD</w:t>
+        <w:t xml:space="preserve">CHƯƠNG 3. CHIẾN LƯỢC TẠO DOANH THU ĐA KÊNH CHO SÀN HẢI SẢN.VN (8 MONETIZATION STREAMS)</w:t>
       </w:r>
     </w:p>
+    <w:p>
+      <w:pPr>
+        <w:spacing w:after="140"/>
+      </w:pPr>
+      <w:r>
+        <w:rPr>
+          <w:sz w:val="20"/>
+          <w:szCs w:val="20"/>
+        </w:rPr>
+        <w:t xml:space="preserve">Để đảm bảo nền tảng tự chủ tài chính và tạo lợi nhuận bền vững hàng năm, HảiSản.vn triển khai mô hình 8 dòng doanh thu (Revenue Streams) đa dạng:
+</w:t>
+      </w:r>
+    </w:p>
+    <w:tbl>
+      <w:tblPr>
+        <w:tblW w:type="pct" w:w="100%"/>
+        <w:tblBorders>
+          <w:top w:val="single" w:color="auto" w:sz="4"/>
+          <w:left w:val="single" w:color="auto" w:sz="4"/>
+          <w:bottom w:val="single" w:color="auto" w:sz="4"/>
+          <w:right w:val="single" w:color="auto" w:sz="4"/>
+          <w:insideH w:val="single" w:color="auto" w:sz="4"/>
+          <w:insideV w:val="single" w:color="auto" w:sz="4"/>
+        </w:tblBorders>
+      </w:tblPr>
+      <w:tblGrid>
+        <w:gridCol w:w="100"/>
+        <w:gridCol w:w="100"/>
+        <w:gridCol w:w="100"/>
+      </w:tblGrid>
+      <w:tr>
+        <w:tc>
+          <w:tcPr>
+            <w:tcW w:type="pct" w:w="30%"/>
+            <w:shd w:fill="0F172A" w:val="clear"/>
+            <w:tcMar>
+              <w:top w:type="dxa" w:w="140"/>
+              <w:left w:type="dxa" w:w="180"/>
+              <w:bottom w:type="dxa" w:w="140"/>
+              <w:right w:type="dxa" w:w="180"/>
+            </w:tcMar>
+          </w:tcPr>
+          <w:p>
+            <w:pPr>
+              <w:jc w:val="left"/>
+            </w:pPr>
+            <w:r>
+              <w:rPr>
+                <w:b/>
+                <w:bCs/>
+                <w:color w:val="FFFFFF"/>
+                <w:sz w:val="22"/>
+                <w:szCs w:val="22"/>
+              </w:rPr>
+              <w:t xml:space="preserve">DÒNG DOANH THU (REVENUE STREAM)</w:t>
+            </w:r>
+          </w:p>
+        </w:tc>
+        <w:tc>
+          <w:tcPr>
+            <w:tcW w:type="pct" w:w="45%"/>
+            <w:shd w:fill="0F172A" w:val="clear"/>
+            <w:tcMar>
+              <w:top w:type="dxa" w:w="140"/>
+              <w:left w:type="dxa" w:w="180"/>
+              <w:bottom w:type="dxa" w:w="140"/>
+              <w:right w:type="dxa" w:w="180"/>
+            </w:tcMar>
+          </w:tcPr>
+          <w:p>
+            <w:pPr>
+              <w:jc w:val="left"/>
+            </w:pPr>
+            <w:r>
+              <w:rPr>
+                <w:b/>
+                <w:bCs/>
+                <w:color w:val="FFFFFF"/>
+                <w:sz w:val="22"/>
+                <w:szCs w:val="22"/>
+              </w:rPr>
+              <w:t xml:space="preserve">MÔ TẢ NGHIỆP VỤ &amp; CƠ CHẾ THU PHÍ</w:t>
+            </w:r>
+          </w:p>
+        </w:tc>
+        <w:tc>
+          <w:tcPr>
+            <w:tcW w:type="pct" w:w="25%"/>
+            <w:shd w:fill="0F172A" w:val="clear"/>
+            <w:tcMar>
+              <w:top w:type="dxa" w:w="140"/>
+              <w:left w:type="dxa" w:w="180"/>
+              <w:bottom w:type="dxa" w:w="140"/>
+              <w:right w:type="dxa" w:w="180"/>
+            </w:tcMar>
+          </w:tcPr>
+          <w:p>
+            <w:pPr>
+              <w:jc w:val="left"/>
+            </w:pPr>
+            <w:r>
+              <w:rPr>
+                <w:b/>
+                <w:bCs/>
+                <w:color w:val="FFFFFF"/>
+                <w:sz w:val="22"/>
+                <w:szCs w:val="22"/>
+              </w:rPr>
+              <w:t xml:space="preserve">DỰ BÁO TỶ TRỌNG DOANH THU</w:t>
+            </w:r>
+          </w:p>
+        </w:tc>
+      </w:tr>
+      <w:tr>
+        <w:tc>
+          <w:tcPr>
+            <w:tcW w:type="pct" w:w="30%"/>
+            <w:tcBorders>
+              <w:top w:val="single" w:color="CBD5E1" w:sz="1"/>
+              <w:left w:val="single" w:color="CBD5E1" w:sz="1"/>
+              <w:bottom w:val="single" w:color="CBD5E1" w:sz="1"/>
+              <w:right w:val="single" w:color="CBD5E1" w:sz="1"/>
+            </w:tcBorders>
+            <w:shd w:fill="F8FAFC" w:val="clear"/>
+            <w:tcMar>
+              <w:top w:type="dxa" w:w="140"/>
+              <w:left w:type="dxa" w:w="180"/>
+              <w:bottom w:type="dxa" w:w="140"/>
+              <w:right w:type="dxa" w:w="180"/>
+            </w:tcMar>
+          </w:tcPr>
+          <w:p>
+            <w:pPr>
+              <w:spacing w:after="80"/>
+            </w:pPr>
+            <w:r>
+              <w:rPr>
+                <w:b/>
+                <w:bCs/>
+                <w:color w:val="1E293B"/>
+                <w:sz w:val="20"/>
+                <w:szCs w:val="20"/>
+              </w:rPr>
+              <w:t xml:space="preserve">1. Phí Hoa Hồng Giao Dịch Sàn</w:t>
+            </w:r>
+          </w:p>
+          <w:p>
+            <w:pPr>
+              <w:spacing w:after="80"/>
+            </w:pPr>
+            <w:r>
+              <w:rPr>
+                <w:b/>
+                <w:bCs/>
+                <w:color w:val="1E293B"/>
+                <w:sz w:val="20"/>
+                <w:szCs w:val="20"/>
+              </w:rPr>
+              <w:t xml:space="preserve">(Transaction Fee / Take Rate)</w:t>
+            </w:r>
+          </w:p>
+        </w:tc>
+        <w:tc>
+          <w:tcPr>
+            <w:tcW w:type="pct" w:w="45%"/>
+            <w:tcBorders>
+              <w:top w:val="single" w:color="CBD5E1" w:sz="1"/>
+              <w:left w:val="single" w:color="CBD5E1" w:sz="1"/>
+              <w:bottom w:val="single" w:color="CBD5E1" w:sz="1"/>
+              <w:right w:val="single" w:color="CBD5E1" w:sz="1"/>
+            </w:tcBorders>
+            <w:shd w:fill="FFFFFF" w:val="clear"/>
+            <w:tcMar>
+              <w:top w:type="dxa" w:w="140"/>
+              <w:left w:type="dxa" w:w="180"/>
+              <w:bottom w:type="dxa" w:w="140"/>
+              <w:right w:type="dxa" w:w="180"/>
+            </w:tcMar>
+          </w:tcPr>
+          <w:p>
+            <w:pPr>
+              <w:spacing w:after="80"/>
+            </w:pPr>
+            <w:r>
+              <w:rPr>
+                <w:b w:val="false"/>
+                <w:bCs w:val="false"/>
+                <w:color w:val="1E293B"/>
+                <w:sz w:val="20"/>
+                <w:szCs w:val="20"/>
+              </w:rPr>
+              <w:t xml:space="preserve">Thu từ 3% - 5% trên mỗi giao dịch mẻ cá thành công được giải ngân qua tài khoản trung gian Escrow.</w:t>
+            </w:r>
+          </w:p>
+        </w:tc>
+        <w:tc>
+          <w:tcPr>
+            <w:tcW w:type="pct" w:w="25%"/>
+            <w:tcBorders>
+              <w:top w:val="single" w:color="CBD5E1" w:sz="1"/>
+              <w:left w:val="single" w:color="CBD5E1" w:sz="1"/>
+              <w:bottom w:val="single" w:color="CBD5E1" w:sz="1"/>
+              <w:right w:val="single" w:color="CBD5E1" w:sz="1"/>
+            </w:tcBorders>
+            <w:shd w:fill="FFFFFF" w:val="clear"/>
+            <w:tcMar>
+              <w:top w:type="dxa" w:w="140"/>
+              <w:left w:type="dxa" w:w="180"/>
+              <w:bottom w:type="dxa" w:w="140"/>
+              <w:right w:type="dxa" w:w="180"/>
+            </w:tcMar>
+          </w:tcPr>
+          <w:p>
+            <w:pPr>
+              <w:spacing w:after="80"/>
+            </w:pPr>
+            <w:r>
+              <w:rPr>
+                <w:b w:val="false"/>
+                <w:bCs w:val="false"/>
+                <w:color w:val="1E293B"/>
+                <w:sz w:val="20"/>
+                <w:szCs w:val="20"/>
+              </w:rPr>
+              <w:t xml:space="preserve">45% Tổng Doanh Thu</w:t>
+            </w:r>
+          </w:p>
+        </w:tc>
+      </w:tr>
+      <w:tr>
+        <w:tc>
+          <w:tcPr>
+            <w:tcW w:type="pct" w:w="30%"/>
+            <w:tcBorders>
+              <w:top w:val="single" w:color="CBD5E1" w:sz="1"/>
+              <w:left w:val="single" w:color="CBD5E1" w:sz="1"/>
+              <w:bottom w:val="single" w:color="CBD5E1" w:sz="1"/>
+              <w:right w:val="single" w:color="CBD5E1" w:sz="1"/>
+            </w:tcBorders>
+            <w:shd w:fill="F8FAFC" w:val="clear"/>
+            <w:tcMar>
+              <w:top w:type="dxa" w:w="140"/>
+              <w:left w:type="dxa" w:w="180"/>
+              <w:bottom w:type="dxa" w:w="140"/>
+              <w:right w:type="dxa" w:w="180"/>
+            </w:tcMar>
+          </w:tcPr>
+          <w:p>
+            <w:pPr>
+              <w:spacing w:after="80"/>
+            </w:pPr>
+            <w:r>
+              <w:rPr>
+                <w:b/>
+                <w:bCs/>
+                <w:color w:val="1E293B"/>
+                <w:sz w:val="20"/>
+                <w:szCs w:val="20"/>
+              </w:rPr>
+              <w:t xml:space="preserve">2. Phí Hội Viên Ngư Dân VIP</w:t>
+            </w:r>
+          </w:p>
+          <w:p>
+            <w:pPr>
+              <w:spacing w:after="80"/>
+            </w:pPr>
+            <w:r>
+              <w:rPr>
+                <w:b/>
+                <w:bCs/>
+                <w:color w:val="1E293B"/>
+                <w:sz w:val="20"/>
+                <w:szCs w:val="20"/>
+              </w:rPr>
+              <w:t xml:space="preserve">(Fisherman Subscription)</w:t>
+            </w:r>
+          </w:p>
+        </w:tc>
+        <w:tc>
+          <w:tcPr>
+            <w:tcW w:type="pct" w:w="45%"/>
+            <w:tcBorders>
+              <w:top w:val="single" w:color="CBD5E1" w:sz="1"/>
+              <w:left w:val="single" w:color="CBD5E1" w:sz="1"/>
+              <w:bottom w:val="single" w:color="CBD5E1" w:sz="1"/>
+              <w:right w:val="single" w:color="CBD5E1" w:sz="1"/>
+            </w:tcBorders>
+            <w:shd w:fill="FFFFFF" w:val="clear"/>
+            <w:tcMar>
+              <w:top w:type="dxa" w:w="140"/>
+              <w:left w:type="dxa" w:w="180"/>
+              <w:bottom w:type="dxa" w:w="140"/>
+              <w:right w:type="dxa" w:w="180"/>
+            </w:tcMar>
+          </w:tcPr>
+          <w:p>
+            <w:pPr>
+              <w:spacing w:after="80"/>
+            </w:pPr>
+            <w:r>
+              <w:rPr>
+                <w:b w:val="false"/>
+                <w:bCs w:val="false"/>
+                <w:color w:val="1E293B"/>
+                <w:sz w:val="20"/>
+                <w:szCs w:val="20"/>
+              </w:rPr>
+              <w:t xml:space="preserve">Thu phí 199.000 VNĐ/tháng (hoặc 1.990.000 VNĐ/năm) cho các vựa cá/chủ tàu để cấp Huy Hiệu Tích Xanh, ưu tiên hiển thị mẻ cá và phân tích giá thị trường.</w:t>
+            </w:r>
+          </w:p>
+        </w:tc>
+        <w:tc>
+          <w:tcPr>
+            <w:tcW w:type="pct" w:w="25%"/>
+            <w:tcBorders>
+              <w:top w:val="single" w:color="CBD5E1" w:sz="1"/>
+              <w:left w:val="single" w:color="CBD5E1" w:sz="1"/>
+              <w:bottom w:val="single" w:color="CBD5E1" w:sz="1"/>
+              <w:right w:val="single" w:color="CBD5E1" w:sz="1"/>
+            </w:tcBorders>
+            <w:shd w:fill="FFFFFF" w:val="clear"/>
+            <w:tcMar>
+              <w:top w:type="dxa" w:w="140"/>
+              <w:left w:type="dxa" w:w="180"/>
+              <w:bottom w:type="dxa" w:w="140"/>
+              <w:right w:type="dxa" w:w="180"/>
+            </w:tcMar>
+          </w:tcPr>
+          <w:p>
+            <w:pPr>
+              <w:spacing w:after="80"/>
+            </w:pPr>
+            <w:r>
+              <w:rPr>
+                <w:b w:val="false"/>
+                <w:bCs w:val="false"/>
+                <w:color w:val="1E293B"/>
+                <w:sz w:val="20"/>
+                <w:szCs w:val="20"/>
+              </w:rPr>
+              <w:t xml:space="preserve">20% Tổng Doanh Thu</w:t>
+            </w:r>
+          </w:p>
+        </w:tc>
+      </w:tr>
+      <w:tr>
+        <w:tc>
+          <w:tcPr>
+            <w:tcW w:type="pct" w:w="30%"/>
+            <w:tcBorders>
+              <w:top w:val="single" w:color="CBD5E1" w:sz="1"/>
+              <w:left w:val="single" w:color="CBD5E1" w:sz="1"/>
+              <w:bottom w:val="single" w:color="CBD5E1" w:sz="1"/>
+              <w:right w:val="single" w:color="CBD5E1" w:sz="1"/>
+            </w:tcBorders>
+            <w:shd w:fill="F8FAFC" w:val="clear"/>
+            <w:tcMar>
+              <w:top w:type="dxa" w:w="140"/>
+              <w:left w:type="dxa" w:w="180"/>
+              <w:bottom w:type="dxa" w:w="140"/>
+              <w:right w:type="dxa" w:w="180"/>
+            </w:tcMar>
+          </w:tcPr>
+          <w:p>
+            <w:pPr>
+              <w:spacing w:after="80"/>
+            </w:pPr>
+            <w:r>
+              <w:rPr>
+                <w:b/>
+                <w:bCs/>
+                <w:color w:val="1E293B"/>
+                <w:sz w:val="20"/>
+                <w:szCs w:val="20"/>
+              </w:rPr>
+              <w:t xml:space="preserve">3. Phí Đẩy Bài &amp; Vị Trí Nổi Bật</w:t>
+            </w:r>
+          </w:p>
+          <w:p>
+            <w:pPr>
+              <w:spacing w:after="80"/>
+            </w:pPr>
+            <w:r>
+              <w:rPr>
+                <w:b/>
+                <w:bCs/>
+                <w:color w:val="1E293B"/>
+                <w:sz w:val="20"/>
+                <w:szCs w:val="20"/>
+              </w:rPr>
+              <w:t xml:space="preserve">(Featured Listing &amp; Pin Boost)</w:t>
+            </w:r>
+          </w:p>
+        </w:tc>
+        <w:tc>
+          <w:tcPr>
+            <w:tcW w:type="pct" w:w="45%"/>
+            <w:tcBorders>
+              <w:top w:val="single" w:color="CBD5E1" w:sz="1"/>
+              <w:left w:val="single" w:color="CBD5E1" w:sz="1"/>
+              <w:bottom w:val="single" w:color="CBD5E1" w:sz="1"/>
+              <w:right w:val="single" w:color="CBD5E1" w:sz="1"/>
+            </w:tcBorders>
+            <w:shd w:fill="FFFFFF" w:val="clear"/>
+            <w:tcMar>
+              <w:top w:type="dxa" w:w="140"/>
+              <w:left w:type="dxa" w:w="180"/>
+              <w:bottom w:type="dxa" w:w="140"/>
+              <w:right w:type="dxa" w:w="180"/>
+            </w:tcMar>
+          </w:tcPr>
+          <w:p>
+            <w:pPr>
+              <w:spacing w:after="80"/>
+            </w:pPr>
+            <w:r>
+              <w:rPr>
+                <w:b w:val="false"/>
+                <w:bCs w:val="false"/>
+                <w:color w:val="1E293B"/>
+                <w:sz w:val="20"/>
+                <w:szCs w:val="20"/>
+              </w:rPr>
+              <w:t xml:space="preserve">Người bán trả 20.000 VNĐ/lần đẩy bài (Bump) hoặc 50.000 VNĐ/ngày để ghim mẻ cá lên vị trí Top trên Bản đồ GeoJSON Leaflet với Marker vàng phát sáng.</w:t>
+            </w:r>
+          </w:p>
+        </w:tc>
+        <w:tc>
+          <w:tcPr>
+            <w:tcW w:type="pct" w:w="25%"/>
+            <w:tcBorders>
+              <w:top w:val="single" w:color="CBD5E1" w:sz="1"/>
+              <w:left w:val="single" w:color="CBD5E1" w:sz="1"/>
+              <w:bottom w:val="single" w:color="CBD5E1" w:sz="1"/>
+              <w:right w:val="single" w:color="CBD5E1" w:sz="1"/>
+            </w:tcBorders>
+            <w:shd w:fill="FFFFFF" w:val="clear"/>
+            <w:tcMar>
+              <w:top w:type="dxa" w:w="140"/>
+              <w:left w:type="dxa" w:w="180"/>
+              <w:bottom w:type="dxa" w:w="140"/>
+              <w:right w:type="dxa" w:w="180"/>
+            </w:tcMar>
+          </w:tcPr>
+          <w:p>
+            <w:pPr>
+              <w:spacing w:after="80"/>
+            </w:pPr>
+            <w:r>
+              <w:rPr>
+                <w:b w:val="false"/>
+                <w:bCs w:val="false"/>
+                <w:color w:val="1E293B"/>
+                <w:sz w:val="20"/>
+                <w:szCs w:val="20"/>
+              </w:rPr>
+              <w:t xml:space="preserve">15% Tổng Doanh Thu</w:t>
+            </w:r>
+          </w:p>
+        </w:tc>
+      </w:tr>
+      <w:tr>
+        <w:tc>
+          <w:tcPr>
+            <w:tcW w:type="pct" w:w="30%"/>
+            <w:tcBorders>
+              <w:top w:val="single" w:color="CBD5E1" w:sz="1"/>
+              <w:left w:val="single" w:color="CBD5E1" w:sz="1"/>
+              <w:bottom w:val="single" w:color="CBD5E1" w:sz="1"/>
+              <w:right w:val="single" w:color="CBD5E1" w:sz="1"/>
+            </w:tcBorders>
+            <w:shd w:fill="F8FAFC" w:val="clear"/>
+            <w:tcMar>
+              <w:top w:type="dxa" w:w="140"/>
+              <w:left w:type="dxa" w:w="180"/>
+              <w:bottom w:type="dxa" w:w="140"/>
+              <w:right w:type="dxa" w:w="180"/>
+            </w:tcMar>
+          </w:tcPr>
+          <w:p>
+            <w:pPr>
+              <w:spacing w:after="80"/>
+            </w:pPr>
+            <w:r>
+              <w:rPr>
+                <w:b/>
+                <w:bCs/>
+                <w:color w:val="1E293B"/>
+                <w:sz w:val="20"/>
+                <w:szCs w:val="20"/>
+              </w:rPr>
+              <w:t xml:space="preserve">4. Phí Kết Nối B2B Nhà Hàng / Khách Sạn</w:t>
+            </w:r>
+          </w:p>
+          <w:p>
+            <w:pPr>
+              <w:spacing w:after="80"/>
+            </w:pPr>
+            <w:r>
+              <w:rPr>
+                <w:b/>
+                <w:bCs/>
+                <w:color w:val="1E293B"/>
+                <w:sz w:val="20"/>
+                <w:szCs w:val="20"/>
+              </w:rPr>
+              <w:t xml:space="preserve">(B2B Contract Fee)</w:t>
+            </w:r>
+          </w:p>
+        </w:tc>
+        <w:tc>
+          <w:tcPr>
+            <w:tcW w:type="pct" w:w="45%"/>
+            <w:tcBorders>
+              <w:top w:val="single" w:color="CBD5E1" w:sz="1"/>
+              <w:left w:val="single" w:color="CBD5E1" w:sz="1"/>
+              <w:bottom w:val="single" w:color="CBD5E1" w:sz="1"/>
+              <w:right w:val="single" w:color="CBD5E1" w:sz="1"/>
+            </w:tcBorders>
+            <w:shd w:fill="FFFFFF" w:val="clear"/>
+            <w:tcMar>
+              <w:top w:type="dxa" w:w="140"/>
+              <w:left w:type="dxa" w:w="180"/>
+              <w:bottom w:type="dxa" w:w="140"/>
+              <w:right w:type="dxa" w:w="180"/>
+            </w:tcMar>
+          </w:tcPr>
+          <w:p>
+            <w:pPr>
+              <w:spacing w:after="80"/>
+            </w:pPr>
+            <w:r>
+              <w:rPr>
+                <w:b w:val="false"/>
+                <w:bCs w:val="false"/>
+                <w:color w:val="1E293B"/>
+                <w:sz w:val="20"/>
+                <w:szCs w:val="20"/>
+              </w:rPr>
+              <w:t xml:space="preserve">Thu 2% phí dịch vụ môi giới kết nối hợp đồng cung ứng hải sản số lượng lớn giữa chủ tàu cá và các chuỗi nhà hàng / khách sạn 5 sao.</w:t>
+            </w:r>
+          </w:p>
+        </w:tc>
+        <w:tc>
+          <w:tcPr>
+            <w:tcW w:type="pct" w:w="25%"/>
+            <w:tcBorders>
+              <w:top w:val="single" w:color="CBD5E1" w:sz="1"/>
+              <w:left w:val="single" w:color="CBD5E1" w:sz="1"/>
+              <w:bottom w:val="single" w:color="CBD5E1" w:sz="1"/>
+              <w:right w:val="single" w:color="CBD5E1" w:sz="1"/>
+            </w:tcBorders>
+            <w:shd w:fill="FFFFFF" w:val="clear"/>
+            <w:tcMar>
+              <w:top w:type="dxa" w:w="140"/>
+              <w:left w:type="dxa" w:w="180"/>
+              <w:bottom w:type="dxa" w:w="140"/>
+              <w:right w:type="dxa" w:w="180"/>
+            </w:tcMar>
+          </w:tcPr>
+          <w:p>
+            <w:pPr>
+              <w:spacing w:after="80"/>
+            </w:pPr>
+            <w:r>
+              <w:rPr>
+                <w:b w:val="false"/>
+                <w:bCs w:val="false"/>
+                <w:color w:val="1E293B"/>
+                <w:sz w:val="20"/>
+                <w:szCs w:val="20"/>
+              </w:rPr>
+              <w:t xml:space="preserve">10% Tổng Doanh Thu</w:t>
+            </w:r>
+          </w:p>
+        </w:tc>
+      </w:tr>
+      <w:tr>
+        <w:tc>
+          <w:tcPr>
+            <w:tcW w:type="pct" w:w="30%"/>
+            <w:tcBorders>
+              <w:top w:val="single" w:color="CBD5E1" w:sz="1"/>
+              <w:left w:val="single" w:color="CBD5E1" w:sz="1"/>
+              <w:bottom w:val="single" w:color="CBD5E1" w:sz="1"/>
+              <w:right w:val="single" w:color="CBD5E1" w:sz="1"/>
+            </w:tcBorders>
+            <w:shd w:fill="F8FAFC" w:val="clear"/>
+            <w:tcMar>
+              <w:top w:type="dxa" w:w="140"/>
+              <w:left w:type="dxa" w:w="180"/>
+              <w:bottom w:type="dxa" w:w="140"/>
+              <w:right w:type="dxa" w:w="180"/>
+            </w:tcMar>
+          </w:tcPr>
+          <w:p>
+            <w:pPr>
+              <w:spacing w:after="80"/>
+            </w:pPr>
+            <w:r>
+              <w:rPr>
+                <w:b/>
+                <w:bCs/>
+                <w:color w:val="1E293B"/>
+                <w:sz w:val="20"/>
+                <w:szCs w:val="20"/>
+              </w:rPr>
+              <w:t xml:space="preserve">5. Hoa Hồng Chia Sẻ Vận Chuyển Lạnh</w:t>
+            </w:r>
+          </w:p>
+          <w:p>
+            <w:pPr>
+              <w:spacing w:after="80"/>
+            </w:pPr>
+            <w:r>
+              <w:rPr>
+                <w:b/>
+                <w:bCs/>
+                <w:color w:val="1E293B"/>
+                <w:sz w:val="20"/>
+                <w:szCs w:val="20"/>
+              </w:rPr>
+              <w:t xml:space="preserve">(Cold-Chain Logistics Affiliate)</w:t>
+            </w:r>
+          </w:p>
+        </w:tc>
+        <w:tc>
+          <w:tcPr>
+            <w:tcW w:type="pct" w:w="45%"/>
+            <w:tcBorders>
+              <w:top w:val="single" w:color="CBD5E1" w:sz="1"/>
+              <w:left w:val="single" w:color="CBD5E1" w:sz="1"/>
+              <w:bottom w:val="single" w:color="CBD5E1" w:sz="1"/>
+              <w:right w:val="single" w:color="CBD5E1" w:sz="1"/>
+            </w:tcBorders>
+            <w:shd w:fill="FFFFFF" w:val="clear"/>
+            <w:tcMar>
+              <w:top w:type="dxa" w:w="140"/>
+              <w:left w:type="dxa" w:w="180"/>
+              <w:bottom w:type="dxa" w:w="140"/>
+              <w:right w:type="dxa" w:w="180"/>
+            </w:tcMar>
+          </w:tcPr>
+          <w:p>
+            <w:pPr>
+              <w:spacing w:after="80"/>
+            </w:pPr>
+            <w:r>
+              <w:rPr>
+                <w:b w:val="false"/>
+                <w:bCs w:val="false"/>
+                <w:color w:val="1E293B"/>
+                <w:sz w:val="20"/>
+                <w:szCs w:val="20"/>
+              </w:rPr>
+              <w:t xml:space="preserve">Nhận 5-10% chiết khấu hoa hồng từ các đối tác vận chuyển lạnh (Ahamove, Lalamove) trên mỗi đơn giao hàng phát sinh qua sàn.</w:t>
+            </w:r>
+          </w:p>
+        </w:tc>
+        <w:tc>
+          <w:tcPr>
+            <w:tcW w:type="pct" w:w="25%"/>
+            <w:tcBorders>
+              <w:top w:val="single" w:color="CBD5E1" w:sz="1"/>
+              <w:left w:val="single" w:color="CBD5E1" w:sz="1"/>
+              <w:bottom w:val="single" w:color="CBD5E1" w:sz="1"/>
+              <w:right w:val="single" w:color="CBD5E1" w:sz="1"/>
+            </w:tcBorders>
+            <w:shd w:fill="FFFFFF" w:val="clear"/>
+            <w:tcMar>
+              <w:top w:type="dxa" w:w="140"/>
+              <w:left w:type="dxa" w:w="180"/>
+              <w:bottom w:type="dxa" w:w="140"/>
+              <w:right w:type="dxa" w:w="180"/>
+            </w:tcMar>
+          </w:tcPr>
+          <w:p>
+            <w:pPr>
+              <w:spacing w:after="80"/>
+            </w:pPr>
+            <w:r>
+              <w:rPr>
+                <w:b w:val="false"/>
+                <w:bCs w:val="false"/>
+                <w:color w:val="1E293B"/>
+                <w:sz w:val="20"/>
+                <w:szCs w:val="20"/>
+              </w:rPr>
+              <w:t xml:space="preserve">5% Tổng Doanh Thu</w:t>
+            </w:r>
+          </w:p>
+        </w:tc>
+      </w:tr>
+      <w:tr>
+        <w:tc>
+          <w:tcPr>
+            <w:tcW w:type="pct" w:w="30%"/>
+            <w:tcBorders>
+              <w:top w:val="single" w:color="CBD5E1" w:sz="1"/>
+              <w:left w:val="single" w:color="CBD5E1" w:sz="1"/>
+              <w:bottom w:val="single" w:color="CBD5E1" w:sz="1"/>
+              <w:right w:val="single" w:color="CBD5E1" w:sz="1"/>
+            </w:tcBorders>
+            <w:shd w:fill="F8FAFC" w:val="clear"/>
+            <w:tcMar>
+              <w:top w:type="dxa" w:w="140"/>
+              <w:left w:type="dxa" w:w="180"/>
+              <w:bottom w:type="dxa" w:w="140"/>
+              <w:right w:type="dxa" w:w="180"/>
+            </w:tcMar>
+          </w:tcPr>
+          <w:p>
+            <w:pPr>
+              <w:spacing w:after="80"/>
+            </w:pPr>
+            <w:r>
+              <w:rPr>
+                <w:b/>
+                <w:bCs/>
+                <w:color w:val="1E293B"/>
+                <w:sz w:val="20"/>
+                <w:szCs w:val="20"/>
+              </w:rPr>
+              <w:t xml:space="preserve">6. Phí Đặt Tour Trải Nghiệm Đi Biển</w:t>
+            </w:r>
+          </w:p>
+          <w:p>
+            <w:pPr>
+              <w:spacing w:after="80"/>
+            </w:pPr>
+            <w:r>
+              <w:rPr>
+                <w:b/>
+                <w:bCs/>
+                <w:color w:val="1E293B"/>
+                <w:sz w:val="20"/>
+                <w:szCs w:val="20"/>
+              </w:rPr>
+              <w:t xml:space="preserve">(Sea-to-Table Tourism Booking)</w:t>
+            </w:r>
+          </w:p>
+        </w:tc>
+        <w:tc>
+          <w:tcPr>
+            <w:tcW w:type="pct" w:w="45%"/>
+            <w:tcBorders>
+              <w:top w:val="single" w:color="CBD5E1" w:sz="1"/>
+              <w:left w:val="single" w:color="CBD5E1" w:sz="1"/>
+              <w:bottom w:val="single" w:color="CBD5E1" w:sz="1"/>
+              <w:right w:val="single" w:color="CBD5E1" w:sz="1"/>
+            </w:tcBorders>
+            <w:shd w:fill="FFFFFF" w:val="clear"/>
+            <w:tcMar>
+              <w:top w:type="dxa" w:w="140"/>
+              <w:left w:type="dxa" w:w="180"/>
+              <w:bottom w:type="dxa" w:w="140"/>
+              <w:right w:type="dxa" w:w="180"/>
+            </w:tcMar>
+          </w:tcPr>
+          <w:p>
+            <w:pPr>
+              <w:spacing w:after="80"/>
+            </w:pPr>
+            <w:r>
+              <w:rPr>
+                <w:b w:val="false"/>
+                <w:bCs w:val="false"/>
+                <w:color w:val="1E293B"/>
+                <w:sz w:val="20"/>
+                <w:szCs w:val="20"/>
+              </w:rPr>
+              <w:t xml:space="preserve">Cho phép ngư dân tích xanh mở dịch vụ dẫn khách du lịch trải nghiệm câu mực/kéo lưới. Thu 10% phí hoa hồng trên mỗi vé book tour.</w:t>
+            </w:r>
+          </w:p>
+        </w:tc>
+        <w:tc>
+          <w:tcPr>
+            <w:tcW w:type="pct" w:w="25%"/>
+            <w:tcBorders>
+              <w:top w:val="single" w:color="CBD5E1" w:sz="1"/>
+              <w:left w:val="single" w:color="CBD5E1" w:sz="1"/>
+              <w:bottom w:val="single" w:color="CBD5E1" w:sz="1"/>
+              <w:right w:val="single" w:color="CBD5E1" w:sz="1"/>
+            </w:tcBorders>
+            <w:shd w:fill="FFFFFF" w:val="clear"/>
+            <w:tcMar>
+              <w:top w:type="dxa" w:w="140"/>
+              <w:left w:type="dxa" w:w="180"/>
+              <w:bottom w:type="dxa" w:w="140"/>
+              <w:right w:type="dxa" w:w="180"/>
+            </w:tcMar>
+          </w:tcPr>
+          <w:p>
+            <w:pPr>
+              <w:spacing w:after="80"/>
+            </w:pPr>
+            <w:r>
+              <w:rPr>
+                <w:b w:val="false"/>
+                <w:bCs w:val="false"/>
+                <w:color w:val="1E293B"/>
+                <w:sz w:val="20"/>
+                <w:szCs w:val="20"/>
+              </w:rPr>
+              <w:t xml:space="preserve">3% Tổng Doanh Thu</w:t>
+            </w:r>
+          </w:p>
+        </w:tc>
+      </w:tr>
+      <w:tr>
+        <w:tc>
+          <w:tcPr>
+            <w:tcW w:type="pct" w:w="30%"/>
+            <w:tcBorders>
+              <w:top w:val="single" w:color="CBD5E1" w:sz="1"/>
+              <w:left w:val="single" w:color="CBD5E1" w:sz="1"/>
+              <w:bottom w:val="single" w:color="CBD5E1" w:sz="1"/>
+              <w:right w:val="single" w:color="CBD5E1" w:sz="1"/>
+            </w:tcBorders>
+            <w:shd w:fill="F8FAFC" w:val="clear"/>
+            <w:tcMar>
+              <w:top w:type="dxa" w:w="140"/>
+              <w:left w:type="dxa" w:w="180"/>
+              <w:bottom w:type="dxa" w:w="140"/>
+              <w:right w:type="dxa" w:w="180"/>
+            </w:tcMar>
+          </w:tcPr>
+          <w:p>
+            <w:pPr>
+              <w:spacing w:after="80"/>
+            </w:pPr>
+            <w:r>
+              <w:rPr>
+                <w:b/>
+                <w:bCs/>
+                <w:color w:val="1E293B"/>
+                <w:sz w:val="20"/>
+                <w:szCs w:val="20"/>
+              </w:rPr>
+              <w:t xml:space="preserve">7. Quảng Cáo Banner Thiết Bị Hàng Hải</w:t>
+            </w:r>
+          </w:p>
+          <w:p>
+            <w:pPr>
+              <w:spacing w:after="80"/>
+            </w:pPr>
+            <w:r>
+              <w:rPr>
+                <w:b/>
+                <w:bCs/>
+                <w:color w:val="1E293B"/>
+                <w:sz w:val="20"/>
+                <w:szCs w:val="20"/>
+              </w:rPr>
+              <w:t xml:space="preserve">(Marine Equipment Ads)</w:t>
+            </w:r>
+          </w:p>
+        </w:tc>
+        <w:tc>
+          <w:tcPr>
+            <w:tcW w:type="pct" w:w="45%"/>
+            <w:tcBorders>
+              <w:top w:val="single" w:color="CBD5E1" w:sz="1"/>
+              <w:left w:val="single" w:color="CBD5E1" w:sz="1"/>
+              <w:bottom w:val="single" w:color="CBD5E1" w:sz="1"/>
+              <w:right w:val="single" w:color="CBD5E1" w:sz="1"/>
+            </w:tcBorders>
+            <w:shd w:fill="FFFFFF" w:val="clear"/>
+            <w:tcMar>
+              <w:top w:type="dxa" w:w="140"/>
+              <w:left w:type="dxa" w:w="180"/>
+              <w:bottom w:type="dxa" w:w="140"/>
+              <w:right w:type="dxa" w:w="180"/>
+            </w:tcMar>
+          </w:tcPr>
+          <w:p>
+            <w:pPr>
+              <w:spacing w:after="80"/>
+            </w:pPr>
+            <w:r>
+              <w:rPr>
+                <w:b w:val="false"/>
+                <w:bCs w:val="false"/>
+                <w:color w:val="1E293B"/>
+                <w:sz w:val="20"/>
+                <w:szCs w:val="20"/>
+              </w:rPr>
+              <w:t xml:space="preserve">Cho phép các đại lý bán lưới đánh cá, động cơ tàu, thiết bị định vị GPS, đá lạnh công nghiệp đặt Banner quảng cáo nhắm mục tiêu ngư dân.</w:t>
+            </w:r>
+          </w:p>
+        </w:tc>
+        <w:tc>
+          <w:tcPr>
+            <w:tcW w:type="pct" w:w="25%"/>
+            <w:tcBorders>
+              <w:top w:val="single" w:color="CBD5E1" w:sz="1"/>
+              <w:left w:val="single" w:color="CBD5E1" w:sz="1"/>
+              <w:bottom w:val="single" w:color="CBD5E1" w:sz="1"/>
+              <w:right w:val="single" w:color="CBD5E1" w:sz="1"/>
+            </w:tcBorders>
+            <w:shd w:fill="FFFFFF" w:val="clear"/>
+            <w:tcMar>
+              <w:top w:type="dxa" w:w="140"/>
+              <w:left w:type="dxa" w:w="180"/>
+              <w:bottom w:type="dxa" w:w="140"/>
+              <w:right w:type="dxa" w:w="180"/>
+            </w:tcMar>
+          </w:tcPr>
+          <w:p>
+            <w:pPr>
+              <w:spacing w:after="80"/>
+            </w:pPr>
+            <w:r>
+              <w:rPr>
+                <w:b w:val="false"/>
+                <w:bCs w:val="false"/>
+                <w:color w:val="1E293B"/>
+                <w:sz w:val="20"/>
+                <w:szCs w:val="20"/>
+              </w:rPr>
+              <w:t xml:space="preserve">2% Tổng Doanh Thu</w:t>
+            </w:r>
+          </w:p>
+        </w:tc>
+      </w:tr>
+      <w:tr>
+        <w:tc>
+          <w:tcPr>
+            <w:tcW w:type="pct" w:w="30%"/>
+            <w:tcBorders>
+              <w:top w:val="single" w:color="CBD5E1" w:sz="1"/>
+              <w:left w:val="single" w:color="CBD5E1" w:sz="1"/>
+              <w:bottom w:val="single" w:color="CBD5E1" w:sz="1"/>
+              <w:right w:val="single" w:color="CBD5E1" w:sz="1"/>
+            </w:tcBorders>
+            <w:shd w:fill="F8FAFC" w:val="clear"/>
+            <w:tcMar>
+              <w:top w:type="dxa" w:w="140"/>
+              <w:left w:type="dxa" w:w="180"/>
+              <w:bottom w:type="dxa" w:w="140"/>
+              <w:right w:type="dxa" w:w="180"/>
+            </w:tcMar>
+          </w:tcPr>
+          <w:p>
+            <w:pPr>
+              <w:spacing w:after="80"/>
+            </w:pPr>
+            <w:r>
+              <w:rPr>
+                <w:b/>
+                <w:bCs/>
+                <w:color w:val="1E293B"/>
+                <w:sz w:val="20"/>
+                <w:szCs w:val="20"/>
+              </w:rPr>
+              <w:t xml:space="preserve">8. Cung Cấp Dữ Liệu B2B API Chỉ Số Giá</w:t>
+            </w:r>
+          </w:p>
+          <w:p>
+            <w:pPr>
+              <w:spacing w:after="80"/>
+            </w:pPr>
+            <w:r>
+              <w:rPr>
+                <w:b/>
+                <w:bCs/>
+                <w:color w:val="1E293B"/>
+                <w:sz w:val="20"/>
+                <w:szCs w:val="20"/>
+              </w:rPr>
+              <w:t xml:space="preserve">(Seafood Market Data API)</w:t>
+            </w:r>
+          </w:p>
+        </w:tc>
+        <w:tc>
+          <w:tcPr>
+            <w:tcW w:type="pct" w:w="45%"/>
+            <w:tcBorders>
+              <w:top w:val="single" w:color="CBD5E1" w:sz="1"/>
+              <w:left w:val="single" w:color="CBD5E1" w:sz="1"/>
+              <w:bottom w:val="single" w:color="CBD5E1" w:sz="1"/>
+              <w:right w:val="single" w:color="CBD5E1" w:sz="1"/>
+            </w:tcBorders>
+            <w:shd w:fill="FFFFFF" w:val="clear"/>
+            <w:tcMar>
+              <w:top w:type="dxa" w:w="140"/>
+              <w:left w:type="dxa" w:w="180"/>
+              <w:bottom w:type="dxa" w:w="140"/>
+              <w:right w:type="dxa" w:w="180"/>
+            </w:tcMar>
+          </w:tcPr>
+          <w:p>
+            <w:pPr>
+              <w:spacing w:after="80"/>
+            </w:pPr>
+            <w:r>
+              <w:rPr>
+                <w:b w:val="false"/>
+                <w:bCs w:val="false"/>
+                <w:color w:val="1E293B"/>
+                <w:sz w:val="20"/>
+                <w:szCs w:val="20"/>
+              </w:rPr>
+              <w:t xml:space="preserve">Bán dữ liệu thống kê biến động giá hải sản và sản lượng đánh bắt theo thời gian thực cho các tập đoàn xuất khẩu hải sản và viện nghiên cứu qua API Subscription.</w:t>
+            </w:r>
+          </w:p>
+        </w:tc>
+        <w:tc>
+          <w:tcPr>
+            <w:tcW w:type="pct" w:w="25%"/>
+            <w:tcBorders>
+              <w:top w:val="single" w:color="CBD5E1" w:sz="1"/>
+              <w:left w:val="single" w:color="CBD5E1" w:sz="1"/>
+              <w:bottom w:val="single" w:color="CBD5E1" w:sz="1"/>
+              <w:right w:val="single" w:color="CBD5E1" w:sz="1"/>
+            </w:tcBorders>
+            <w:shd w:fill="FFFFFF" w:val="clear"/>
+            <w:tcMar>
+              <w:top w:type="dxa" w:w="140"/>
+              <w:left w:type="dxa" w:w="180"/>
+              <w:bottom w:type="dxa" w:w="140"/>
+              <w:right w:type="dxa" w:w="180"/>
+            </w:tcMar>
+          </w:tcPr>
+          <w:p>
+            <w:pPr>
+              <w:spacing w:after="80"/>
+            </w:pPr>
+            <w:r>
+              <w:rPr>
+                <w:b w:val="false"/>
+                <w:bCs w:val="false"/>
+                <w:color w:val="1E293B"/>
+                <w:sz w:val="20"/>
+                <w:szCs w:val="20"/>
+              </w:rPr>
+              <w:t xml:space="preserve">0. Quản lý / Dài hạn</w:t>
+            </w:r>
+          </w:p>
+        </w:tc>
+      </w:tr>
+    </w:tbl>
     <w:p>
       <w:pPr>
         <w:spacing w:after="240"/>
       </w:pPr>
-      <w:r>
-        <w:rPr>
-          <w:sz w:val="20"/>
-          <w:szCs w:val="20"/>
-        </w:rPr>
-        <w:t xml:space="preserve">Nếu muốn thương mại hóa mã nguồn hiện tại thành một Startup Thương mại Điện tử Hải sản thực chiến, nhóm chỉ cần bổ sung 4 module sau:
-</w:t>
-      </w:r>
-      <w:r>
-        <w:rPr>
-          <w:b/>
-          <w:bCs/>
-        </w:rPr>
-        <w:t xml:space="preserve">1. Module Escrow &amp; Ví Điện Tử (Escrow Wallet System): </w:t>
-      </w:r>
-      <w:r>
-        <w:t xml:space="preserve">Thêm mảng `Wallets` và `EscrowTransactions` trong DB. Tiền người mua tạm giữ tại Escrow ➔ Người mua bấm 'Đã nhận hải sản tươi' ➔ Trừ 3% phí sàn ➔ Chuyển 97% tiền vào ví Ngư dân. Nếu hải sản hỏng, kích hoạt luồng Tranh chấp &amp; Hoàn tiền tự động.
-</w:t>
-      </w:r>
-      <w:r>
-        <w:rPr>
-          <w:b/>
-          <w:bCs/>
-        </w:rPr>
-        <w:t xml:space="preserve">2. Module Gọi Xe Giao Hàng Đông Lạnh (Automated Cold Delivery API): </w:t>
-      </w:r>
-      <w:r>
-        <w:t xml:space="preserve">Tích hợp Webhook Ahamove / Lalamove / ViettelPost. Lấy tọa độ GeoJSON Ngư dân và Người mua ➔ Tự động tính cước ship đông lạnh từng mét ➔ Đặt tài xế tự động.
-</w:t>
-      </w:r>
-      <w:r>
-        <w:rPr>
-          <w:b/>
-          <w:bCs/>
-        </w:rPr>
-        <w:t xml:space="preserve">3. Native Mobile App Cho Ngư Dân (Fisherman Offline App): </w:t>
-      </w:r>
-      <w:r>
-        <w:t xml:space="preserve">Phát triển ứng dụng React Native sử dụng WatermelonDB / SQLite lưu trữ offline ngoài biển. Ngư dân ghi nhật ký cabin không cần mạng ➔ Tàu cập bến tự động sync DB về Express.js backend.
-</w:t>
-      </w:r>
-      <w:r>
-        <w:rPr>
-          <w:b/>
-          <w:bCs/>
-        </w:rPr>
-        <w:t xml:space="preserve">4. AI Định Giá &amp; Gợi Ý Món Ăn Hải Sản (AI Seafood Dynamic Pricing): </w:t>
-      </w:r>
-      <w:r>
-        <w:t xml:space="preserve">Dùng Machine Learning phân tích dữ liệu lịch sử giá hải sản tại các cảng cá lớn để đưa ra biểu đồ dự báo giá theo tuần cho ngư dân.</w:t>
-      </w:r>
     </w:p>
     <w:p>
       <w:pPr>
@@ -1211,7 +2202,79 @@
           <w:sz w:val="24"/>
           <w:szCs w:val="24"/>
         </w:rPr>
-        <w:t xml:space="preserve">CHƯƠNG 4. ĐÁNH GIÁ TỔNG KẾT VÀ KẾT LUẬN</w:t>
+        <w:t xml:space="preserve">CHƯƠNG 4. BỐN NẤC THANG NÂNG CẤP ĐỂ BIẾN SEA_SHOP THÀNH PRODUCT THƯƠNG MẠI TRIỆU USD</w:t>
+      </w:r>
+    </w:p>
+    <w:p>
+      <w:pPr>
+        <w:spacing w:after="240"/>
+      </w:pPr>
+      <w:r>
+        <w:rPr>
+          <w:sz w:val="20"/>
+          <w:szCs w:val="20"/>
+        </w:rPr>
+        <w:t xml:space="preserve">Nếu muốn thương mại hóa mã nguồn hiện tại thành một Startup Thương mại Điện tử Hải sản thực chiến, nhóm chỉ cần bổ sung 4 module sau:
+</w:t>
+      </w:r>
+      <w:r>
+        <w:rPr>
+          <w:b/>
+          <w:bCs/>
+        </w:rPr>
+        <w:t xml:space="preserve">1. Module Escrow &amp; Ví Điện Tử (Escrow Wallet System): </w:t>
+      </w:r>
+      <w:r>
+        <w:t xml:space="preserve">Thêm mảng `Wallets` và `EscrowTransactions` trong DB. Tiền người mua tạm giữ tại Escrow ➔ Người mua bấm 'Đã nhận hải sản tươi' ➔ Trừ 3% phí sàn ➔ Chuyển 97% tiền vào ví Ngư dân. Nếu hải sản hỏng, kích hoạt luồng Tranh chấp &amp; Hoàn tiền tự động.
+</w:t>
+      </w:r>
+      <w:r>
+        <w:rPr>
+          <w:b/>
+          <w:bCs/>
+        </w:rPr>
+        <w:t xml:space="preserve">2. Module Gọi Xe Giao Hàng Đông Lạnh (Automated Cold Delivery API): </w:t>
+      </w:r>
+      <w:r>
+        <w:t xml:space="preserve">Tích hợp Webhook Ahamove / Lalamove / ViettelPost. Lấy tọa độ GeoJSON Ngư dân và Người mua ➔ Tự động tính cước ship đông lạnh từng mét ➔ Đặt tài xế tự động.
+</w:t>
+      </w:r>
+      <w:r>
+        <w:rPr>
+          <w:b/>
+          <w:bCs/>
+        </w:rPr>
+        <w:t xml:space="preserve">3. Native Mobile App Cho Ngư Dân (Fisherman Offline App): </w:t>
+      </w:r>
+      <w:r>
+        <w:t xml:space="preserve">Phát triển ứng dụng React Native sử dụng WatermelonDB / SQLite lưu trữ offline ngoài biển. Ngư dân ghi nhật ký cabin không cần mạng ➔ Tàu cập bến tự động sync DB về Express.js backend.
+</w:t>
+      </w:r>
+      <w:r>
+        <w:rPr>
+          <w:b/>
+          <w:bCs/>
+        </w:rPr>
+        <w:t xml:space="preserve">4. AI Định Giá &amp; Gợi Ý Món Ăn Hải Sản (AI Seafood Dynamic Pricing): </w:t>
+      </w:r>
+      <w:r>
+        <w:t xml:space="preserve">Dùng Machine Learning phân tích dữ liệu lịch sử giá hải sản tại các cảng cá lớn để đưa ra biểu đồ dự báo giá theo tuần cho ngư dân.</w:t>
+      </w:r>
+    </w:p>
+    <w:p>
+      <w:pPr>
+        <w:pStyle w:val="Heading1"/>
+        <w:spacing w:after="180" w:before="240"/>
+      </w:pPr>
+      <w:r>
+        <w:rPr>
+          <w:b/>
+          <w:bCs/>
+          <w:color w:val="0F172A"/>
+          <w:sz w:val="24"/>
+          <w:szCs w:val="24"/>
+        </w:rPr>
+        <w:t xml:space="preserve">CHƯƠNG 5. ĐÁNH GIÁ TỔNG KẾT VÀ KẾT LUẬN</w:t>
       </w:r>
     </w:p>
     <w:p>

</xml_diff>

<commit_message>
docs: add 2-sided targeted ads (Seafood Dipping Sauces for Buyers & Boat Gear for Sellers) to so_sanh_voi_product_real.docx
</commit_message>
<xml_diff>
--- a/so_sanh_voi_product_real.docx
+++ b/so_sanh_voi_product_real.docx
@@ -31,7 +31,7 @@
           <w:sz w:val="22"/>
           <w:szCs w:val="22"/>
         </w:rPr>
-        <w:t xml:space="preserve">Dự án HảiSản.vn (sea_shop) — Đánh Giá Hạ Tầng Kỹ Thuật, 8 Mô Hình Doanh Thu Đa Kênh &amp; Lộ Trình Triển Khai</w:t>
+        <w:t xml:space="preserve">Dự án HảiSản.vn (sea_shop) — Đánh Giá Hạ Tầng Kỹ Thuật, Quảng Cáo Nhắm Mục Tiêu 2 Phía (Buyer &amp; Seller) &amp; Mô Hình 9 Dòng Doanh Thu</w:t>
       </w:r>
     </w:p>
     <w:p>
@@ -84,7 +84,7 @@
           <w:sz w:val="20"/>
           <w:szCs w:val="20"/>
         </w:rPr>
-        <w:t xml:space="preserve">có thể vận hành kinh doanh sinh lời hàng triệu USD, hệ thống đòi hỏi thêm các mắt xích về Quản lý Tài chính (Escrow Wallet), Chuỗi Cung Ứng Lạnh (Cold-Chain Logistics), Xác thực Pháp lý Tự động (eKYC), và Mô hình Thu Băng Thông/Phí Hoa Hồng Sàn.</w:t>
+        <w:t xml:space="preserve">có thể vận hành kinh doanh sinh lời hàng triệu USD, hệ thống đòi hỏi thêm các mắt xích về Quản lý Tài chính (Escrow Wallet), Chuỗi Cung Ứng Lạnh (Cold-Chain Logistics), Quảng cáo nhắm mục tiêu 2 phía và Mô hình Thu Phí Hoa Hồng Sàn.</w:t>
       </w:r>
     </w:p>
     <w:p>
@@ -692,7 +692,7 @@
                 <w:sz w:val="20"/>
                 <w:szCs w:val="20"/>
               </w:rPr>
-              <w:t xml:space="preserve">• Đa dạng luồng doanh thu (Multi Revenue Streams):</w:t>
+              <w:t xml:space="preserve">• Đa dạng 9 luồng doanh thu (Multi Revenue Streams):</w:t>
             </w:r>
           </w:p>
           <w:p>
@@ -722,37 +722,37 @@
                 <w:sz w:val="20"/>
                 <w:szCs w:val="20"/>
               </w:rPr>
-              <w:t xml:space="preserve">  2. Phí đẩy tin nổi bật (Featured Listing)</w:t>
-            </w:r>
-          </w:p>
-          <w:p>
-            <w:pPr>
-              <w:spacing w:after="80"/>
-            </w:pPr>
-            <w:r>
-              <w:rPr>
-                <w:b w:val="false"/>
-                <w:bCs w:val="false"/>
-                <w:color w:val="1E293B"/>
-                <w:sz w:val="20"/>
-                <w:szCs w:val="20"/>
-              </w:rPr>
-              <w:t xml:space="preserve">  3. Phí hội viên Ngư dân VIP (200k/tháng)</w:t>
-            </w:r>
-          </w:p>
-          <w:p>
-            <w:pPr>
-              <w:spacing w:after="80"/>
-            </w:pPr>
-            <w:r>
-              <w:rPr>
-                <w:b w:val="false"/>
-                <w:bCs w:val="false"/>
-                <w:color w:val="1E293B"/>
-                <w:sz w:val="20"/>
-                <w:szCs w:val="20"/>
-              </w:rPr>
-              <w:t xml:space="preserve">  4. Quảng cáo Banner vựa cá.</w:t>
+              <w:t xml:space="preserve">  2. Phí Quảng cáo Nước chấm &amp; Đồ chế biến (Buyer-Side Ads)</w:t>
+            </w:r>
+          </w:p>
+          <w:p>
+            <w:pPr>
+              <w:spacing w:after="80"/>
+            </w:pPr>
+            <w:r>
+              <w:rPr>
+                <w:b w:val="false"/>
+                <w:bCs w:val="false"/>
+                <w:color w:val="1E293B"/>
+                <w:sz w:val="20"/>
+                <w:szCs w:val="20"/>
+              </w:rPr>
+              <w:t xml:space="preserve">  3. Phí Quảng cáo Ngư cụ &amp; Động cơ tàu (Seller-Side Ads)</w:t>
+            </w:r>
+          </w:p>
+          <w:p>
+            <w:pPr>
+              <w:spacing w:after="80"/>
+            </w:pPr>
+            <w:r>
+              <w:rPr>
+                <w:b w:val="false"/>
+                <w:bCs w:val="false"/>
+                <w:color w:val="1E293B"/>
+                <w:sz w:val="20"/>
+                <w:szCs w:val="20"/>
+              </w:rPr>
+              <w:t xml:space="preserve">  4. Phí hội viên VIP &amp; Đẩy bài.</w:t>
             </w:r>
           </w:p>
         </w:tc>
@@ -1139,20 +1139,58 @@
           <w:sz w:val="24"/>
           <w:szCs w:val="24"/>
         </w:rPr>
-        <w:t xml:space="preserve">CHƯƠNG 3. CHIẾN LƯỢC TẠO DOANH THU ĐA KÊNH CHO SÀN HẢI SẢN.VN (8 MONETIZATION STREAMS)</w:t>
+        <w:t xml:space="preserve">CHƯƠNG 3. CHIẾN LƯỢC QUẢNG CÁO NHẮM MỤC TIÊU 2 PHÍA &amp; MÔ HÌNH 9 DÒNG DOANH THU ĐA KÊNH</w:t>
       </w:r>
     </w:p>
     <w:p>
       <w:pPr>
-        <w:spacing w:after="140"/>
+        <w:spacing w:after="240"/>
       </w:pPr>
       <w:r>
         <w:rPr>
           <w:sz w:val="20"/>
           <w:szCs w:val="20"/>
         </w:rPr>
-        <w:t xml:space="preserve">Để đảm bảo nền tảng tự chủ tài chính và tạo lợi nhuận bền vững hàng năm, HảiSản.vn triển khai mô hình 8 dòng doanh thu (Revenue Streams) đa dạng:
+        <w:t xml:space="preserve">Điểm đột phá tài chính của HảiSản.vn là mô hình </w:t>
+      </w:r>
+      <w:r>
+        <w:rPr>
+          <w:b/>
+          <w:bCs/>
+          <w:color w:val="0D9488"/>
+          <w:sz w:val="20"/>
+          <w:szCs w:val="20"/>
+        </w:rPr>
+        <w:t xml:space="preserve">Quảng Cáo Ngữ Cảnh Nhắm Mục Tiêu 2 Phía (2-Sided Contextual Advertising) </w:t>
+      </w:r>
+      <w:r>
+        <w:rPr>
+          <w:sz w:val="20"/>
+          <w:szCs w:val="20"/>
+        </w:rPr>
+        <w:t xml:space="preserve">phục vụ đồng thời cả Người mua (Buyer) lẫn Ngư dân (Seller):
 </w:t>
+      </w:r>
+      <w:r>
+        <w:rPr>
+          <w:b/>
+          <w:bCs/>
+        </w:rPr>
+        <w:t xml:space="preserve">• Quảng cáo Phía Người Mua (Buyer-Side Ads): </w:t>
+      </w:r>
+      <w:r>
+        <w:t xml:space="preserve">Khi Người mua xem trang chi tiết Tôm hùm, Mực lá hay Cua Cà Mau, hệ thống tự động hiển thị Banner/Widget gợi ý các loại nước chấm đặc sản (Muối Ớt Xanh Nha Trang, Nước Mắm Nhĩ Phú Quốc, Muối Tiêu Chanh) và gia vị chế biến hải sản. Thu phí hoa hồng Affiliate 10-15% hoặc phí quảng cáo thương hiệu.
+</w:t>
+      </w:r>
+      <w:r>
+        <w:rPr>
+          <w:b/>
+          <w:bCs/>
+        </w:rPr>
+        <w:t xml:space="preserve">• Quảng cáo Phía Ngư Dân / Người Bán (Seller-Side Ads): </w:t>
+      </w:r>
+      <w:r>
+        <w:t xml:space="preserve">Khi Ngư dân đăng mẻ cá hoặc viết Nhật ký Cabin (Boat Log), hệ thống tự động gợi ý Banner các đại lý bán Ngư cụ, Động cơ thủy (Yanmar, Yamaha), Máy dò cá Sonar Garmin, Đèn LED đánh bắt mực, Thùng đá giữ nhiệt công nghiệp và Sơn chống hàu đáy tàu. Cho thuê vị trí Banner độc quyền (5-10 triệu/tháng/đại lý).</w:t>
       </w:r>
     </w:p>
     <w:tbl>
@@ -1366,7 +1404,7 @@
                 <w:sz w:val="20"/>
                 <w:szCs w:val="20"/>
               </w:rPr>
-              <w:t xml:space="preserve">45% Tổng Doanh Thu</w:t>
+              <w:t xml:space="preserve">40% Tổng Doanh Thu</w:t>
             </w:r>
           </w:p>
         </w:tc>
@@ -1401,22 +1439,22 @@
                 <w:sz w:val="20"/>
                 <w:szCs w:val="20"/>
               </w:rPr>
-              <w:t xml:space="preserve">2. Phí Hội Viên Ngư Dân VIP</w:t>
-            </w:r>
-          </w:p>
-          <w:p>
-            <w:pPr>
-              <w:spacing w:after="80"/>
-            </w:pPr>
-            <w:r>
-              <w:rPr>
-                <w:b/>
-                <w:bCs/>
-                <w:color w:val="1E293B"/>
-                <w:sz w:val="20"/>
-                <w:szCs w:val="20"/>
-              </w:rPr>
-              <w:t xml:space="preserve">(Fisherman Subscription)</w:t>
+              <w:t xml:space="preserve">2. QC Nước Chấm &amp; Gia Vị Hải Sản</w:t>
+            </w:r>
+          </w:p>
+          <w:p>
+            <w:pPr>
+              <w:spacing w:after="80"/>
+            </w:pPr>
+            <w:r>
+              <w:rPr>
+                <w:b/>
+                <w:bCs/>
+                <w:color w:val="1E293B"/>
+                <w:sz w:val="20"/>
+                <w:szCs w:val="20"/>
+              </w:rPr>
+              <w:t xml:space="preserve">(Buyer-Side Sauce &amp; Condiment Ads)</w:t>
             </w:r>
           </w:p>
         </w:tc>
@@ -1449,7 +1487,7 @@
                 <w:sz w:val="20"/>
                 <w:szCs w:val="20"/>
               </w:rPr>
-              <w:t xml:space="preserve">Thu phí 199.000 VNĐ/tháng (hoặc 1.990.000 VNĐ/năm) cho các vựa cá/chủ tàu để cấp Huy Hiệu Tích Xanh, ưu tiên hiển thị mẻ cá và phân tích giá thị trường.</w:t>
+              <w:t xml:space="preserve">Gợi ý mua kèm Muối ớt xanh, Nước mắm nhĩ Phú Quốc, Sốt bơ tỏi khi người mua chọn hải sản. Thu 10-15% hoa hồng Affiliate hoặc Banner tài trợ.</w:t>
             </w:r>
           </w:p>
         </w:tc>
@@ -1482,7 +1520,7 @@
                 <w:sz w:val="20"/>
                 <w:szCs w:val="20"/>
               </w:rPr>
-              <w:t xml:space="preserve">20% Tổng Doanh Thu</w:t>
+              <w:t xml:space="preserve">15% Tổng Doanh Thu</w:t>
             </w:r>
           </w:p>
         </w:tc>
@@ -1517,22 +1555,22 @@
                 <w:sz w:val="20"/>
                 <w:szCs w:val="20"/>
               </w:rPr>
-              <w:t xml:space="preserve">3. Phí Đẩy Bài &amp; Vị Trí Nổi Bật</w:t>
-            </w:r>
-          </w:p>
-          <w:p>
-            <w:pPr>
-              <w:spacing w:after="80"/>
-            </w:pPr>
-            <w:r>
-              <w:rPr>
-                <w:b/>
-                <w:bCs/>
-                <w:color w:val="1E293B"/>
-                <w:sz w:val="20"/>
-                <w:szCs w:val="20"/>
-              </w:rPr>
-              <w:t xml:space="preserve">(Featured Listing &amp; Pin Boost)</w:t>
+              <w:t xml:space="preserve">3. QC Thiết Bị Tàu Thuyền &amp; Ngư Cụ</w:t>
+            </w:r>
+          </w:p>
+          <w:p>
+            <w:pPr>
+              <w:spacing w:after="80"/>
+            </w:pPr>
+            <w:r>
+              <w:rPr>
+                <w:b/>
+                <w:bCs/>
+                <w:color w:val="1E293B"/>
+                <w:sz w:val="20"/>
+                <w:szCs w:val="20"/>
+              </w:rPr>
+              <w:t xml:space="preserve">(Seller-Side Marine Gear Ads)</w:t>
             </w:r>
           </w:p>
         </w:tc>
@@ -1565,7 +1603,7 @@
                 <w:sz w:val="20"/>
                 <w:szCs w:val="20"/>
               </w:rPr>
-              <w:t xml:space="preserve">Người bán trả 20.000 VNĐ/lần đẩy bài (Bump) hoặc 50.000 VNĐ/ngày để ghim mẻ cá lên vị trí Top trên Bản đồ GeoJSON Leaflet với Marker vàng phát sáng.</w:t>
+              <w:t xml:space="preserve">Gợi ý động cơ tàu Yanmar, máy dò cá Garmin, đèn LED câu mực, thùng đá công nghiệp cho ngư dân. Cho thuê Banner 5-10 triệu/tháng/đại lý.</w:t>
             </w:r>
           </w:p>
         </w:tc>
@@ -1633,22 +1671,22 @@
                 <w:sz w:val="20"/>
                 <w:szCs w:val="20"/>
               </w:rPr>
-              <w:t xml:space="preserve">4. Phí Kết Nối B2B Nhà Hàng / Khách Sạn</w:t>
-            </w:r>
-          </w:p>
-          <w:p>
-            <w:pPr>
-              <w:spacing w:after="80"/>
-            </w:pPr>
-            <w:r>
-              <w:rPr>
-                <w:b/>
-                <w:bCs/>
-                <w:color w:val="1E293B"/>
-                <w:sz w:val="20"/>
-                <w:szCs w:val="20"/>
-              </w:rPr>
-              <w:t xml:space="preserve">(B2B Contract Fee)</w:t>
+              <w:t xml:space="preserve">4. Phí Hội Viên Ngư Dân VIP</w:t>
+            </w:r>
+          </w:p>
+          <w:p>
+            <w:pPr>
+              <w:spacing w:after="80"/>
+            </w:pPr>
+            <w:r>
+              <w:rPr>
+                <w:b/>
+                <w:bCs/>
+                <w:color w:val="1E293B"/>
+                <w:sz w:val="20"/>
+                <w:szCs w:val="20"/>
+              </w:rPr>
+              <w:t xml:space="preserve">(Fisherman Subscription)</w:t>
             </w:r>
           </w:p>
         </w:tc>
@@ -1681,7 +1719,7 @@
                 <w:sz w:val="20"/>
                 <w:szCs w:val="20"/>
               </w:rPr>
-              <w:t xml:space="preserve">Thu 2% phí dịch vụ môi giới kết nối hợp đồng cung ứng hải sản số lượng lớn giữa chủ tàu cá và các chuỗi nhà hàng / khách sạn 5 sao.</w:t>
+              <w:t xml:space="preserve">Thu phí 199.000 VNĐ/tháng (hoặc 1.990.000 VNĐ/năm) để cấp Huy Hiệu Tích Xanh, ưu tiên hiển thị mẻ cá và phân tích giá thị trường.</w:t>
             </w:r>
           </w:p>
         </w:tc>
@@ -1749,22 +1787,22 @@
                 <w:sz w:val="20"/>
                 <w:szCs w:val="20"/>
               </w:rPr>
-              <w:t xml:space="preserve">5. Hoa Hồng Chia Sẻ Vận Chuyển Lạnh</w:t>
-            </w:r>
-          </w:p>
-          <w:p>
-            <w:pPr>
-              <w:spacing w:after="80"/>
-            </w:pPr>
-            <w:r>
-              <w:rPr>
-                <w:b/>
-                <w:bCs/>
-                <w:color w:val="1E293B"/>
-                <w:sz w:val="20"/>
-                <w:szCs w:val="20"/>
-              </w:rPr>
-              <w:t xml:space="preserve">(Cold-Chain Logistics Affiliate)</w:t>
+              <w:t xml:space="preserve">5. Phí Đẩy Bài &amp; Vị Trí Nổi Bật</w:t>
+            </w:r>
+          </w:p>
+          <w:p>
+            <w:pPr>
+              <w:spacing w:after="80"/>
+            </w:pPr>
+            <w:r>
+              <w:rPr>
+                <w:b/>
+                <w:bCs/>
+                <w:color w:val="1E293B"/>
+                <w:sz w:val="20"/>
+                <w:szCs w:val="20"/>
+              </w:rPr>
+              <w:t xml:space="preserve">(Featured Listing &amp; Pin Boost)</w:t>
             </w:r>
           </w:p>
         </w:tc>
@@ -1797,7 +1835,7 @@
                 <w:sz w:val="20"/>
                 <w:szCs w:val="20"/>
               </w:rPr>
-              <w:t xml:space="preserve">Nhận 5-10% chiết khấu hoa hồng từ các đối tác vận chuyển lạnh (Ahamove, Lalamove) trên mỗi đơn giao hàng phát sinh qua sàn.</w:t>
+              <w:t xml:space="preserve">Người bán trả 20.000 VNĐ/lần đẩy bài (Bump) hoặc 50.000 VNĐ/ngày để ghim mẻ cá lên vị trí Top trên Bản đồ GeoJSON Leaflet với Marker vàng.</w:t>
             </w:r>
           </w:p>
         </w:tc>
@@ -1830,7 +1868,7 @@
                 <w:sz w:val="20"/>
                 <w:szCs w:val="20"/>
               </w:rPr>
-              <w:t xml:space="preserve">5% Tổng Doanh Thu</w:t>
+              <w:t xml:space="preserve">8% Tổng Doanh Thu</w:t>
             </w:r>
           </w:p>
         </w:tc>
@@ -1865,22 +1903,22 @@
                 <w:sz w:val="20"/>
                 <w:szCs w:val="20"/>
               </w:rPr>
-              <w:t xml:space="preserve">6. Phí Đặt Tour Trải Nghiệm Đi Biển</w:t>
-            </w:r>
-          </w:p>
-          <w:p>
-            <w:pPr>
-              <w:spacing w:after="80"/>
-            </w:pPr>
-            <w:r>
-              <w:rPr>
-                <w:b/>
-                <w:bCs/>
-                <w:color w:val="1E293B"/>
-                <w:sz w:val="20"/>
-                <w:szCs w:val="20"/>
-              </w:rPr>
-              <w:t xml:space="preserve">(Sea-to-Table Tourism Booking)</w:t>
+              <w:t xml:space="preserve">6. Phí Kết Nối B2B Nhà Hàng / Khách Sạn</w:t>
+            </w:r>
+          </w:p>
+          <w:p>
+            <w:pPr>
+              <w:spacing w:after="80"/>
+            </w:pPr>
+            <w:r>
+              <w:rPr>
+                <w:b/>
+                <w:bCs/>
+                <w:color w:val="1E293B"/>
+                <w:sz w:val="20"/>
+                <w:szCs w:val="20"/>
+              </w:rPr>
+              <w:t xml:space="preserve">(B2B Contract Fee)</w:t>
             </w:r>
           </w:p>
         </w:tc>
@@ -1913,7 +1951,7 @@
                 <w:sz w:val="20"/>
                 <w:szCs w:val="20"/>
               </w:rPr>
-              <w:t xml:space="preserve">Cho phép ngư dân tích xanh mở dịch vụ dẫn khách du lịch trải nghiệm câu mực/kéo lưới. Thu 10% phí hoa hồng trên mỗi vé book tour.</w:t>
+              <w:t xml:space="preserve">Thu 2% phí dịch vụ môi giới kết nối hợp đồng cung ứng hải sản số lượng lớn giữa chủ tàu cá và các chuỗi nhà hàng / khách sạn 5 sao.</w:t>
             </w:r>
           </w:p>
         </w:tc>
@@ -1946,7 +1984,7 @@
                 <w:sz w:val="20"/>
                 <w:szCs w:val="20"/>
               </w:rPr>
-              <w:t xml:space="preserve">3% Tổng Doanh Thu</w:t>
+              <w:t xml:space="preserve">5% Tổng Doanh Thu</w:t>
             </w:r>
           </w:p>
         </w:tc>
@@ -1981,22 +2019,22 @@
                 <w:sz w:val="20"/>
                 <w:szCs w:val="20"/>
               </w:rPr>
-              <w:t xml:space="preserve">7. Quảng Cáo Banner Thiết Bị Hàng Hải</w:t>
-            </w:r>
-          </w:p>
-          <w:p>
-            <w:pPr>
-              <w:spacing w:after="80"/>
-            </w:pPr>
-            <w:r>
-              <w:rPr>
-                <w:b/>
-                <w:bCs/>
-                <w:color w:val="1E293B"/>
-                <w:sz w:val="20"/>
-                <w:szCs w:val="20"/>
-              </w:rPr>
-              <w:t xml:space="preserve">(Marine Equipment Ads)</w:t>
+              <w:t xml:space="preserve">7. Hoa Hồng Chia Sẻ Vận Chuyển Lạnh</w:t>
+            </w:r>
+          </w:p>
+          <w:p>
+            <w:pPr>
+              <w:spacing w:after="80"/>
+            </w:pPr>
+            <w:r>
+              <w:rPr>
+                <w:b/>
+                <w:bCs/>
+                <w:color w:val="1E293B"/>
+                <w:sz w:val="20"/>
+                <w:szCs w:val="20"/>
+              </w:rPr>
+              <w:t xml:space="preserve">(Cold-Chain Logistics Affiliate)</w:t>
             </w:r>
           </w:p>
         </w:tc>
@@ -2029,7 +2067,7 @@
                 <w:sz w:val="20"/>
                 <w:szCs w:val="20"/>
               </w:rPr>
-              <w:t xml:space="preserve">Cho phép các đại lý bán lưới đánh cá, động cơ tàu, thiết bị định vị GPS, đá lạnh công nghiệp đặt Banner quảng cáo nhắm mục tiêu ngư dân.</w:t>
+              <w:t xml:space="preserve">Nhận 5-10% chiết khấu hoa hồng từ đối tác vận chuyển lạnh (Ahamove, Lalamove) trên mỗi đơn giao phát sinh qua sàn.</w:t>
             </w:r>
           </w:p>
         </w:tc>
@@ -2062,7 +2100,7 @@
                 <w:sz w:val="20"/>
                 <w:szCs w:val="20"/>
               </w:rPr>
-              <w:t xml:space="preserve">2% Tổng Doanh Thu</w:t>
+              <w:t xml:space="preserve">4% Tổng Doanh Thu</w:t>
             </w:r>
           </w:p>
         </w:tc>
@@ -2097,7 +2135,123 @@
                 <w:sz w:val="20"/>
                 <w:szCs w:val="20"/>
               </w:rPr>
-              <w:t xml:space="preserve">8. Cung Cấp Dữ Liệu B2B API Chỉ Số Giá</w:t>
+              <w:t xml:space="preserve">8. Phí Đặt Tour Trải Nghiệm Đi Biển</w:t>
+            </w:r>
+          </w:p>
+          <w:p>
+            <w:pPr>
+              <w:spacing w:after="80"/>
+            </w:pPr>
+            <w:r>
+              <w:rPr>
+                <w:b/>
+                <w:bCs/>
+                <w:color w:val="1E293B"/>
+                <w:sz w:val="20"/>
+                <w:szCs w:val="20"/>
+              </w:rPr>
+              <w:t xml:space="preserve">(Sea-to-Table Tourism Booking)</w:t>
+            </w:r>
+          </w:p>
+        </w:tc>
+        <w:tc>
+          <w:tcPr>
+            <w:tcW w:type="pct" w:w="45%"/>
+            <w:tcBorders>
+              <w:top w:val="single" w:color="CBD5E1" w:sz="1"/>
+              <w:left w:val="single" w:color="CBD5E1" w:sz="1"/>
+              <w:bottom w:val="single" w:color="CBD5E1" w:sz="1"/>
+              <w:right w:val="single" w:color="CBD5E1" w:sz="1"/>
+            </w:tcBorders>
+            <w:shd w:fill="FFFFFF" w:val="clear"/>
+            <w:tcMar>
+              <w:top w:type="dxa" w:w="140"/>
+              <w:left w:type="dxa" w:w="180"/>
+              <w:bottom w:type="dxa" w:w="140"/>
+              <w:right w:type="dxa" w:w="180"/>
+            </w:tcMar>
+          </w:tcPr>
+          <w:p>
+            <w:pPr>
+              <w:spacing w:after="80"/>
+            </w:pPr>
+            <w:r>
+              <w:rPr>
+                <w:b w:val="false"/>
+                <w:bCs w:val="false"/>
+                <w:color w:val="1E293B"/>
+                <w:sz w:val="20"/>
+                <w:szCs w:val="20"/>
+              </w:rPr>
+              <w:t xml:space="preserve">Cho phép ngư dân tích xanh mở dịch vụ dẫn khách du lịch trải nghiệm câu mực/kéo lưới. Thu 10% phí hoa hồng trên mỗi vé book tour.</w:t>
+            </w:r>
+          </w:p>
+        </w:tc>
+        <w:tc>
+          <w:tcPr>
+            <w:tcW w:type="pct" w:w="25%"/>
+            <w:tcBorders>
+              <w:top w:val="single" w:color="CBD5E1" w:sz="1"/>
+              <w:left w:val="single" w:color="CBD5E1" w:sz="1"/>
+              <w:bottom w:val="single" w:color="CBD5E1" w:sz="1"/>
+              <w:right w:val="single" w:color="CBD5E1" w:sz="1"/>
+            </w:tcBorders>
+            <w:shd w:fill="FFFFFF" w:val="clear"/>
+            <w:tcMar>
+              <w:top w:type="dxa" w:w="140"/>
+              <w:left w:type="dxa" w:w="180"/>
+              <w:bottom w:type="dxa" w:w="140"/>
+              <w:right w:type="dxa" w:w="180"/>
+            </w:tcMar>
+          </w:tcPr>
+          <w:p>
+            <w:pPr>
+              <w:spacing w:after="80"/>
+            </w:pPr>
+            <w:r>
+              <w:rPr>
+                <w:b w:val="false"/>
+                <w:bCs w:val="false"/>
+                <w:color w:val="1E293B"/>
+                <w:sz w:val="20"/>
+                <w:szCs w:val="20"/>
+              </w:rPr>
+              <w:t xml:space="preserve">2% Tổng Doanh Thu</w:t>
+            </w:r>
+          </w:p>
+        </w:tc>
+      </w:tr>
+      <w:tr>
+        <w:tc>
+          <w:tcPr>
+            <w:tcW w:type="pct" w:w="30%"/>
+            <w:tcBorders>
+              <w:top w:val="single" w:color="CBD5E1" w:sz="1"/>
+              <w:left w:val="single" w:color="CBD5E1" w:sz="1"/>
+              <w:bottom w:val="single" w:color="CBD5E1" w:sz="1"/>
+              <w:right w:val="single" w:color="CBD5E1" w:sz="1"/>
+            </w:tcBorders>
+            <w:shd w:fill="F8FAFC" w:val="clear"/>
+            <w:tcMar>
+              <w:top w:type="dxa" w:w="140"/>
+              <w:left w:type="dxa" w:w="180"/>
+              <w:bottom w:type="dxa" w:w="140"/>
+              <w:right w:type="dxa" w:w="180"/>
+            </w:tcMar>
+          </w:tcPr>
+          <w:p>
+            <w:pPr>
+              <w:spacing w:after="80"/>
+            </w:pPr>
+            <w:r>
+              <w:rPr>
+                <w:b/>
+                <w:bCs/>
+                <w:color w:val="1E293B"/>
+                <w:sz w:val="20"/>
+                <w:szCs w:val="20"/>
+              </w:rPr>
+              <w:t xml:space="preserve">9. Cung Cấp API Chỉ Số Giá Hải Sản</w:t>
             </w:r>
           </w:p>
           <w:p>
@@ -2145,7 +2299,7 @@
                 <w:sz w:val="20"/>
                 <w:szCs w:val="20"/>
               </w:rPr>
-              <w:t xml:space="preserve">Bán dữ liệu thống kê biến động giá hải sản và sản lượng đánh bắt theo thời gian thực cho các tập đoàn xuất khẩu hải sản và viện nghiên cứu qua API Subscription.</w:t>
+              <w:t xml:space="preserve">Bán dữ liệu thống kê biến động giá hải sản và sản lượng đánh bắt theo thời gian thực cho các tập đoàn xuất khẩu hải sản qua API Subscription.</w:t>
             </w:r>
           </w:p>
         </w:tc>
@@ -2178,7 +2332,7 @@
                 <w:sz w:val="20"/>
                 <w:szCs w:val="20"/>
               </w:rPr>
-              <w:t xml:space="preserve">0. Quản lý / Dài hạn</w:t>
+              <w:t xml:space="preserve">Dài hạn B2B</w:t>
             </w:r>
           </w:p>
         </w:tc>
@@ -2211,10 +2365,13 @@
       </w:pPr>
       <w:r>
         <w:rPr>
-          <w:sz w:val="20"/>
-          <w:szCs w:val="20"/>
+          <w:b/>
+          <w:bCs/>
         </w:rPr>
-        <w:t xml:space="preserve">Nếu muốn thương mại hóa mã nguồn hiện tại thành một Startup Thương mại Điện tử Hải sản thực chiến, nhóm chỉ cần bổ sung 4 module sau:
+        <w:t xml:space="preserve">1. Module Escrow &amp; Ví Điện Tử (Escrow Wallet System): </w:t>
+      </w:r>
+      <w:r>
+        <w:t xml:space="preserve">Thêm mảng `Wallets` và `EscrowTransactions` trong DB. Tiền người mua tạm giữ tại Escrow ➔ Người mua bấm 'Đã nhận hải sản tươi' ➔ Trừ 3% phí sàn ➔ Chuyển 97% tiền vào ví Ngư dân.
 </w:t>
       </w:r>
       <w:r>
@@ -2222,10 +2379,10 @@
           <w:b/>
           <w:bCs/>
         </w:rPr>
-        <w:t xml:space="preserve">1. Module Escrow &amp; Ví Điện Tử (Escrow Wallet System): </w:t>
-      </w:r>
-      <w:r>
-        <w:t xml:space="preserve">Thêm mảng `Wallets` và `EscrowTransactions` trong DB. Tiền người mua tạm giữ tại Escrow ➔ Người mua bấm 'Đã nhận hải sản tươi' ➔ Trừ 3% phí sàn ➔ Chuyển 97% tiền vào ví Ngư dân. Nếu hải sản hỏng, kích hoạt luồng Tranh chấp &amp; Hoàn tiền tự động.
+        <w:t xml:space="preserve">2. Module Quảng Cáo Ngữ Cảnh 2 Phía (2-Sided Targeted Ad Engine): </w:t>
+      </w:r>
+      <w:r>
+        <w:t xml:space="preserve">Tích hợp Banner Widget gợi ý Nước chấm hải sản (Muối ớt xanh, Nước mắm nhĩ) cho Người mua và Ngư cụ/Động cơ tàu cá cho Ngư dân.
 </w:t>
       </w:r>
       <w:r>
@@ -2233,10 +2390,10 @@
           <w:b/>
           <w:bCs/>
         </w:rPr>
-        <w:t xml:space="preserve">2. Module Gọi Xe Giao Hàng Đông Lạnh (Automated Cold Delivery API): </w:t>
-      </w:r>
-      <w:r>
-        <w:t xml:space="preserve">Tích hợp Webhook Ahamove / Lalamove / ViettelPost. Lấy tọa độ GeoJSON Ngư dân và Người mua ➔ Tự động tính cước ship đông lạnh từng mét ➔ Đặt tài xế tự động.
+        <w:t xml:space="preserve">3. Module Gọi Xe Giao Hàng Đông Lạnh (Automated Cold Delivery API): </w:t>
+      </w:r>
+      <w:r>
+        <w:t xml:space="preserve">Tích hợp Webhook Ahamove / Lalamove. Tự động tính cước ship đông lạnh từng mét ➔ Đặt tài xế tự động.
 </w:t>
       </w:r>
       <w:r>
@@ -2244,21 +2401,10 @@
           <w:b/>
           <w:bCs/>
         </w:rPr>
-        <w:t xml:space="preserve">3. Native Mobile App Cho Ngư Dân (Fisherman Offline App): </w:t>
-      </w:r>
-      <w:r>
-        <w:t xml:space="preserve">Phát triển ứng dụng React Native sử dụng WatermelonDB / SQLite lưu trữ offline ngoài biển. Ngư dân ghi nhật ký cabin không cần mạng ➔ Tàu cập bến tự động sync DB về Express.js backend.
-</w:t>
-      </w:r>
-      <w:r>
-        <w:rPr>
-          <w:b/>
-          <w:bCs/>
-        </w:rPr>
-        <w:t xml:space="preserve">4. AI Định Giá &amp; Gợi Ý Món Ăn Hải Sản (AI Seafood Dynamic Pricing): </w:t>
-      </w:r>
-      <w:r>
-        <w:t xml:space="preserve">Dùng Machine Learning phân tích dữ liệu lịch sử giá hải sản tại các cảng cá lớn để đưa ra biểu đồ dự báo giá theo tuần cho ngư dân.</w:t>
+        <w:t xml:space="preserve">4. Native Mobile App Cho Ngư Dân (Fisherman Offline App): </w:t>
+      </w:r>
+      <w:r>
+        <w:t xml:space="preserve">Phát triển ứng dụng React Native sử dụng WatermelonDB / SQLite lưu trữ offline ngoài biển. Ngư dân ghi nhật ký cabin không cần mạng ➔ Tàu cập bến tự động sync DB về Express.js backend.</w:t>
       </w:r>
     </w:p>
     <w:p>

</xml_diff>